<commit_message>
Corrected Asset Group in the doc file
</commit_message>
<xml_diff>
--- a/ExpenseTracker_API_Guide.docx
+++ b/ExpenseTracker_API_Guide.docx
@@ -15456,8 +15456,109 @@
                 <w:color w:val="000000"/>
                 <w:sz w:val="18"/>
                 <w:szCs w:val="18"/>
-              </w:rPr>
-              <w:t>TANGIBLE, INTANGIBLE, FINANCIAL, CURRENT</w:t>
+                <w:rtl w:val="0"/>
+                <w:lang w:val="en-IN" w:bidi="en-IN" w:eastAsia="en-IN"/>
+              </w:rPr>
+              <w:t>INVESTMENT</w:t>
+            </w:r>
+            <w:r>
+              <w:rPr>
+                <w:rFonts w:ascii="Calibri" w:hAnsi="Calibri" w:cs="Calibri" w:eastAsia="Calibri"/>
+                <w:b w:val="0"/>
+                <w:i w:val="0"/>
+                <w:bCs w:val="0"/>
+                <w:iCs w:val="0"/>
+                <w:color w:val="000000"/>
+                <w:sz w:val="18"/>
+                <w:szCs w:val="18"/>
+              </w:rPr>
+              <w:t xml:space="preserve">, </w:t>
+            </w:r>
+            <w:r>
+              <w:rPr>
+                <w:rFonts w:ascii="Calibri" w:hAnsi="Calibri" w:cs="Calibri" w:eastAsia="Calibri"/>
+                <w:b w:val="0"/>
+                <w:i w:val="0"/>
+                <w:bCs w:val="0"/>
+                <w:iCs w:val="0"/>
+                <w:color w:val="000000"/>
+                <w:sz w:val="18"/>
+                <w:szCs w:val="18"/>
+                <w:rtl w:val="0"/>
+                <w:lang w:val="en-IN" w:bidi="en-IN" w:eastAsia="en-IN"/>
+              </w:rPr>
+              <w:t>J</w:t>
+            </w:r>
+            <w:r>
+              <w:rPr>
+                <w:rFonts w:ascii="Calibri" w:hAnsi="Calibri" w:cs="Calibri" w:eastAsia="Calibri"/>
+                <w:b w:val="0"/>
+                <w:i w:val="0"/>
+                <w:bCs w:val="0"/>
+                <w:iCs w:val="0"/>
+                <w:color w:val="000000"/>
+                <w:sz w:val="18"/>
+                <w:szCs w:val="18"/>
+                <w:rtl w:val="0"/>
+                <w:lang w:val="en-IN" w:bidi="en-IN" w:eastAsia="en-IN"/>
+              </w:rPr>
+              <w:t>EWELLERY</w:t>
+            </w:r>
+            <w:r>
+              <w:rPr>
+                <w:rFonts w:ascii="Calibri" w:hAnsi="Calibri" w:cs="Calibri" w:eastAsia="Calibri"/>
+                <w:b w:val="0"/>
+                <w:i w:val="0"/>
+                <w:bCs w:val="0"/>
+                <w:iCs w:val="0"/>
+                <w:color w:val="000000"/>
+                <w:sz w:val="18"/>
+                <w:szCs w:val="18"/>
+              </w:rPr>
+              <w:t xml:space="preserve">, </w:t>
+            </w:r>
+            <w:r>
+              <w:rPr>
+                <w:rFonts w:ascii="Calibri" w:hAnsi="Calibri" w:cs="Calibri" w:eastAsia="Calibri"/>
+                <w:b w:val="0"/>
+                <w:i w:val="0"/>
+                <w:bCs w:val="0"/>
+                <w:iCs w:val="0"/>
+                <w:color w:val="000000"/>
+                <w:sz w:val="18"/>
+                <w:szCs w:val="18"/>
+                <w:rtl w:val="0"/>
+                <w:lang w:val="en-IN" w:bidi="en-IN" w:eastAsia="en-IN"/>
+              </w:rPr>
+              <w:t>MARKET_INVESTMENT</w:t>
+            </w:r>
+            <w:r>
+              <w:rPr>
+                <w:rFonts w:ascii="Calibri" w:hAnsi="Calibri" w:cs="Calibri" w:eastAsia="Calibri"/>
+                <w:b w:val="0"/>
+                <w:i w:val="0"/>
+                <w:bCs w:val="0"/>
+                <w:iCs w:val="0"/>
+                <w:color w:val="000000"/>
+                <w:sz w:val="18"/>
+                <w:szCs w:val="18"/>
+              </w:rPr>
+              <w:t xml:space="preserve">, </w:t>
+            </w:r>
+            <w:r>
+              <w:rPr>
+                <w:rFonts w:ascii="Calibri" w:hAnsi="Calibri" w:cs="Calibri" w:eastAsia="Calibri"/>
+                <w:b w:val="0"/>
+                <w:i w:val="0"/>
+                <w:bCs w:val="0"/>
+                <w:iCs w:val="0"/>
+                <w:color w:val="000000"/>
+                <w:sz w:val="18"/>
+                <w:szCs w:val="18"/>
+                <w:rtl w:val="0"/>
+                <w:lang w:val="en-IN" w:bidi="en-IN" w:eastAsia="en-IN"/>
+              </w:rPr>
+              <w:t>PROPERTY, CASH, OTHER</w:t>
             </w:r>
           </w:p>
         </w:tc>

</xml_diff>